<commit_message>
updarted schematic and simulation
</commit_message>
<xml_diff>
--- a/docs/Bauteilauswahl.docx
+++ b/docs/Bauteilauswahl.docx
@@ -20,7 +20,15 @@
     </w:p>
     <w:p>
       <w:r>
-        <w:t xml:space="preserve">Alle verlinkten Bauteile sind auf Mouser/Digikey vorrätig </w:t>
+        <w:t>Alle verlinkten Bauteile sind auf Mouser/</w:t>
+      </w:r>
+      <w:proofErr w:type="spellStart"/>
+      <w:r>
+        <w:t>Digikey</w:t>
+      </w:r>
+      <w:proofErr w:type="spellEnd"/>
+      <w:r>
+        <w:t xml:space="preserve"> vorrätig </w:t>
       </w:r>
     </w:p>
     <w:p>
@@ -28,7 +36,15 @@
         <w:pStyle w:val="Heading1"/>
       </w:pPr>
       <w:r>
-        <w:t>Software Defined Radio</w:t>
+        <w:t xml:space="preserve">Software </w:t>
+      </w:r>
+      <w:proofErr w:type="spellStart"/>
+      <w:r>
+        <w:t>Defined</w:t>
+      </w:r>
+      <w:proofErr w:type="spellEnd"/>
+      <w:r>
+        <w:t xml:space="preserve"> Radio</w:t>
       </w:r>
     </w:p>
     <w:tbl>
@@ -106,7 +122,15 @@
               <w:cnfStyle w:val="100000000000" w:firstRow="1" w:lastRow="0" w:firstColumn="0" w:lastColumn="0" w:oddVBand="0" w:evenVBand="0" w:oddHBand="0" w:evenHBand="0" w:firstRowFirstColumn="0" w:firstRowLastColumn="0" w:lastRowFirstColumn="0" w:lastRowLastColumn="0"/>
             </w:pPr>
             <w:r>
-              <w:t>Peak-to-Peak Differential</w:t>
+              <w:t>Peak-</w:t>
+            </w:r>
+            <w:proofErr w:type="spellStart"/>
+            <w:r>
+              <w:t>to</w:t>
+            </w:r>
+            <w:proofErr w:type="spellEnd"/>
+            <w:r>
+              <w:t>-Peak Differential</w:t>
             </w:r>
           </w:p>
         </w:tc>
@@ -168,8 +192,13 @@
               <w:cnfStyle w:val="000000100000" w:firstRow="0" w:lastRow="0" w:firstColumn="0" w:lastColumn="0" w:oddVBand="0" w:evenVBand="0" w:oddHBand="1" w:evenHBand="0" w:firstRowFirstColumn="0" w:firstRowLastColumn="0" w:lastRowFirstColumn="0" w:lastRowLastColumn="0"/>
             </w:pPr>
             <w:r>
-              <w:t>900 – 1000 Mhz</w:t>
-            </w:r>
+              <w:t xml:space="preserve">900 – 1000 </w:t>
+            </w:r>
+            <w:proofErr w:type="spellStart"/>
+            <w:r>
+              <w:t>Mhz</w:t>
+            </w:r>
+            <w:proofErr w:type="spellEnd"/>
           </w:p>
         </w:tc>
         <w:tc>
@@ -223,8 +252,13 @@
               <w:t>,</w:t>
             </w:r>
             <w:r>
-              <w:t>6 dBm</w:t>
-            </w:r>
+              <w:t xml:space="preserve">6 </w:t>
+            </w:r>
+            <w:proofErr w:type="spellStart"/>
+            <w:r>
+              <w:t>dBm</w:t>
+            </w:r>
+            <w:proofErr w:type="spellEnd"/>
           </w:p>
         </w:tc>
         <w:tc>
@@ -236,8 +270,13 @@
               <w:cnfStyle w:val="000000100000" w:firstRow="0" w:lastRow="0" w:firstColumn="0" w:lastColumn="0" w:oddVBand="0" w:evenVBand="0" w:oddHBand="1" w:evenHBand="0" w:firstRowFirstColumn="0" w:firstRowLastColumn="0" w:lastRowFirstColumn="0" w:lastRowLastColumn="0"/>
             </w:pPr>
             <w:r>
-              <w:t>14m 6 dBm</w:t>
-            </w:r>
+              <w:t xml:space="preserve">14m 6 </w:t>
+            </w:r>
+            <w:proofErr w:type="spellStart"/>
+            <w:r>
+              <w:t>dBm</w:t>
+            </w:r>
+            <w:proofErr w:type="spellEnd"/>
           </w:p>
         </w:tc>
       </w:tr>
@@ -247,8 +286,13 @@
         <w:t>Am ADC und DAC</w:t>
       </w:r>
       <w:r>
-        <w:t xml:space="preserve"> des RFSoC</w:t>
-      </w:r>
+        <w:t xml:space="preserve"> des </w:t>
+      </w:r>
+      <w:proofErr w:type="spellStart"/>
+      <w:r>
+        <w:t>RFSoC</w:t>
+      </w:r>
+      <w:proofErr w:type="spellEnd"/>
       <w:r>
         <w:t xml:space="preserve"> befinden sich </w:t>
       </w:r>
@@ -256,19 +300,28 @@
         <w:t>MABA-011118</w:t>
       </w:r>
       <w:r>
-        <w:t xml:space="preserve"> Baluns, diese erzeugen ein Single-Ended 50 Ohm Signal!</w:t>
+        <w:t xml:space="preserve"> </w:t>
+      </w:r>
+      <w:proofErr w:type="spellStart"/>
+      <w:r>
+        <w:t>Baluns</w:t>
+      </w:r>
+      <w:proofErr w:type="spellEnd"/>
+      <w:r>
+        <w:t>, diese erzeugen ein Single-</w:t>
+      </w:r>
+      <w:proofErr w:type="spellStart"/>
+      <w:r>
+        <w:t>Ended</w:t>
+      </w:r>
+      <w:proofErr w:type="spellEnd"/>
+      <w:r>
+        <w:t xml:space="preserve"> 50 Ohm Signal!</w:t>
       </w:r>
     </w:p>
     <w:p>
       <w:pPr>
         <w:pStyle w:val="Heading1"/>
-      </w:pPr>
-      <w:r>
-        <w:t>Power</w:t>
-      </w:r>
-    </w:p>
-    <w:p>
-      <w:pPr>
         <w:rPr>
           <w:lang w:val="en-US"/>
         </w:rPr>
@@ -277,13 +330,54 @@
         <w:rPr>
           <w:lang w:val="en-US"/>
         </w:rPr>
-        <w:t>Power Supply über 5V USB-</w:t>
-      </w:r>
-      <w:r>
+        <w:t>Power</w:t>
+      </w:r>
+    </w:p>
+    <w:p>
+      <w:pPr>
         <w:rPr>
           <w:lang w:val="en-US"/>
         </w:rPr>
-        <w:t xml:space="preserve"> Gerät. </w:t>
+      </w:pPr>
+      <w:r>
+        <w:rPr>
+          <w:lang w:val="en-US"/>
+        </w:rPr>
+        <w:t xml:space="preserve">Power Supply </w:t>
+      </w:r>
+      <w:proofErr w:type="spellStart"/>
+      <w:r>
+        <w:rPr>
+          <w:lang w:val="en-US"/>
+        </w:rPr>
+        <w:t>über</w:t>
+      </w:r>
+      <w:proofErr w:type="spellEnd"/>
+      <w:r>
+        <w:rPr>
+          <w:lang w:val="en-US"/>
+        </w:rPr>
+        <w:t xml:space="preserve"> 5V USB-</w:t>
+      </w:r>
+      <w:r>
+        <w:rPr>
+          <w:lang w:val="en-US"/>
+        </w:rPr>
+        <w:t xml:space="preserve"> </w:t>
+      </w:r>
+      <w:proofErr w:type="spellStart"/>
+      <w:r>
+        <w:rPr>
+          <w:lang w:val="en-US"/>
+        </w:rPr>
+        <w:t>Gerät</w:t>
+      </w:r>
+      <w:proofErr w:type="spellEnd"/>
+      <w:r>
+        <w:rPr>
+          <w:lang w:val="en-US"/>
+        </w:rPr>
+        <w:t xml:space="preserve">. </w:t>
       </w:r>
     </w:p>
     <w:tbl>
@@ -841,12 +935,14 @@
           <w:lang w:val="en-US"/>
         </w:rPr>
       </w:pPr>
+      <w:proofErr w:type="spellStart"/>
       <w:r>
         <w:rPr>
           <w:lang w:val="en-US"/>
         </w:rPr>
         <w:t>Oszillator</w:t>
       </w:r>
+      <w:proofErr w:type="spellEnd"/>
     </w:p>
     <w:p>
       <w:r>
@@ -858,18 +954,36 @@
     </w:p>
     <w:p>
       <w:r>
-        <w:t xml:space="preserve">Um aus dem </w:t>
-      </w:r>
-      <w:r>
-        <w:t>LVDS</w:t>
-      </w:r>
-      <w:r>
-        <w:t>-Signal einen glatten Sinus ohne Gleichanteil un 50 Ohm Terminierung zu erzeugen, wird ein 1:2 Balun, Tiefpass und Blocking Kondensatoren verwendet.</w:t>
+        <w:t xml:space="preserve">Um aus dem LVDS-Signal einen glatten Sinus ohne Gleichanteil </w:t>
+      </w:r>
+      <w:proofErr w:type="spellStart"/>
+      <w:r>
+        <w:t>un</w:t>
+      </w:r>
+      <w:proofErr w:type="spellEnd"/>
+      <w:r>
+        <w:t xml:space="preserve"> 50 Ohm Terminierung zu erzeugen, wird ein 1:2 Balun, Tiefpass und Blocking Kondensatoren verwendet.</w:t>
       </w:r>
     </w:p>
     <w:p>
       <w:r>
-        <w:t>Das Signal wird gesplittet und für jeweils den Rx und Tx Pfad verstärkt.</w:t>
+        <w:t xml:space="preserve">Das Signal wird gesplittet und für jeweils den </w:t>
+      </w:r>
+      <w:proofErr w:type="spellStart"/>
+      <w:r>
+        <w:t>Rx</w:t>
+      </w:r>
+      <w:proofErr w:type="spellEnd"/>
+      <w:r>
+        <w:t xml:space="preserve"> und </w:t>
+      </w:r>
+      <w:proofErr w:type="spellStart"/>
+      <w:r>
+        <w:t>Tx</w:t>
+      </w:r>
+      <w:proofErr w:type="spellEnd"/>
+      <w:r>
+        <w:t xml:space="preserve"> Pfad verstärkt.</w:t>
       </w:r>
       <w:r>
         <w:t xml:space="preserve"> </w:t>
@@ -905,6 +1019,7 @@
                 <w:lang w:val="en-US"/>
               </w:rPr>
             </w:pPr>
+            <w:proofErr w:type="spellStart"/>
             <w:r>
               <w:rPr>
                 <w:lang w:val="en-US"/>
@@ -912,6 +1027,7 @@
               <w:lastRenderedPageBreak/>
               <w:t>Oszillator</w:t>
             </w:r>
+            <w:proofErr w:type="spellEnd"/>
           </w:p>
         </w:tc>
         <w:tc>
@@ -925,12 +1041,14 @@
                 <w:lang w:val="en-US"/>
               </w:rPr>
             </w:pPr>
+            <w:proofErr w:type="spellStart"/>
             <w:r>
               <w:rPr>
                 <w:lang w:val="en-US"/>
               </w:rPr>
               <w:t>Frequenz</w:t>
             </w:r>
+            <w:proofErr w:type="spellEnd"/>
           </w:p>
         </w:tc>
         <w:tc>
@@ -944,12 +1062,14 @@
                 <w:lang w:val="en-US"/>
               </w:rPr>
             </w:pPr>
+            <w:proofErr w:type="spellStart"/>
             <w:r>
               <w:rPr>
                 <w:lang w:val="en-US"/>
               </w:rPr>
               <w:t>Frequenzstabilität</w:t>
             </w:r>
+            <w:proofErr w:type="spellEnd"/>
           </w:p>
         </w:tc>
         <w:tc>
@@ -1342,12 +1462,14 @@
                 <w:lang w:val="en-US"/>
               </w:rPr>
             </w:pPr>
+            <w:proofErr w:type="spellStart"/>
             <w:r>
               <w:rPr>
                 <w:lang w:val="en-US"/>
               </w:rPr>
               <w:t>Frequenzbereich</w:t>
             </w:r>
+            <w:proofErr w:type="spellEnd"/>
           </w:p>
         </w:tc>
         <w:tc>
@@ -1396,11 +1518,19 @@
                 <w:lang w:val="en-US"/>
               </w:rPr>
             </w:pPr>
-            <w:r>
-              <w:rPr>
-                <w:lang w:val="en-US"/>
-              </w:rPr>
-              <w:t>Ouptut Termination</w:t>
+            <w:proofErr w:type="spellStart"/>
+            <w:r>
+              <w:rPr>
+                <w:lang w:val="en-US"/>
+              </w:rPr>
+              <w:t>Ouptut</w:t>
+            </w:r>
+            <w:proofErr w:type="spellEnd"/>
+            <w:r>
+              <w:rPr>
+                <w:lang w:val="en-US"/>
+              </w:rPr>
+              <w:t xml:space="preserve"> Termination</w:t>
             </w:r>
           </w:p>
         </w:tc>
@@ -1574,12 +1704,14 @@
                 <w:lang w:val="en-US"/>
               </w:rPr>
             </w:pPr>
+            <w:proofErr w:type="spellStart"/>
             <w:r>
               <w:rPr>
                 <w:lang w:val="en-US"/>
               </w:rPr>
               <w:t>Tiefpass</w:t>
             </w:r>
+            <w:proofErr w:type="spellEnd"/>
           </w:p>
         </w:tc>
         <w:tc>
@@ -1593,12 +1725,14 @@
                 <w:lang w:val="en-US"/>
               </w:rPr>
             </w:pPr>
+            <w:proofErr w:type="spellStart"/>
             <w:r>
               <w:rPr>
                 <w:lang w:val="en-US"/>
               </w:rPr>
               <w:t>Frequenz</w:t>
             </w:r>
+            <w:proofErr w:type="spellEnd"/>
           </w:p>
         </w:tc>
         <w:tc>
@@ -1806,12 +1940,14 @@
                 <w:lang w:val="en-US"/>
               </w:rPr>
             </w:pPr>
+            <w:proofErr w:type="spellStart"/>
             <w:r>
               <w:rPr>
                 <w:lang w:val="en-US"/>
               </w:rPr>
               <w:t>Frequenz</w:t>
             </w:r>
+            <w:proofErr w:type="spellEnd"/>
           </w:p>
         </w:tc>
         <w:tc>
@@ -1974,12 +2110,14 @@
                 <w:lang w:val="en-US"/>
               </w:rPr>
             </w:pPr>
+            <w:proofErr w:type="spellStart"/>
             <w:r>
               <w:rPr>
                 <w:lang w:val="en-US"/>
               </w:rPr>
               <w:t>Verstärker</w:t>
             </w:r>
+            <w:proofErr w:type="spellEnd"/>
           </w:p>
         </w:tc>
         <w:tc>
@@ -1993,12 +2131,14 @@
                 <w:lang w:val="en-US"/>
               </w:rPr>
             </w:pPr>
+            <w:proofErr w:type="spellStart"/>
             <w:r>
               <w:rPr>
                 <w:lang w:val="en-US"/>
               </w:rPr>
               <w:t>Frequenz</w:t>
             </w:r>
+            <w:proofErr w:type="spellEnd"/>
           </w:p>
         </w:tc>
         <w:tc>
@@ -2469,8 +2609,13 @@
               <w:cnfStyle w:val="000000100000" w:firstRow="0" w:lastRow="0" w:firstColumn="0" w:lastColumn="0" w:oddVBand="0" w:evenVBand="0" w:oddHBand="1" w:evenHBand="0" w:firstRowFirstColumn="0" w:firstRowLastColumn="0" w:lastRowFirstColumn="0" w:lastRowLastColumn="0"/>
             </w:pPr>
             <w:r>
-              <w:t>7 dBm</w:t>
-            </w:r>
+              <w:t xml:space="preserve">7 </w:t>
+            </w:r>
+            <w:proofErr w:type="spellStart"/>
+            <w:r>
+              <w:t>dBm</w:t>
+            </w:r>
+            <w:proofErr w:type="spellEnd"/>
           </w:p>
         </w:tc>
         <w:tc>
@@ -2518,16 +2663,58 @@
       <w:pPr>
         <w:pStyle w:val="Heading1"/>
       </w:pPr>
-      <w:r>
-        <w:t>Bandpass Zielfrequen</w:t>
-      </w:r>
+      <w:proofErr w:type="spellStart"/>
+      <w:r>
+        <w:t>Bandpass</w:t>
+      </w:r>
+      <w:proofErr w:type="spellEnd"/>
+      <w:r>
+        <w:t xml:space="preserve"> </w:t>
+      </w:r>
+      <w:proofErr w:type="spellStart"/>
+      <w:r>
+        <w:t>Zielfrequen</w:t>
+      </w:r>
+      <w:proofErr w:type="spellEnd"/>
     </w:p>
     <w:p>
       <w:r>
-        <w:t xml:space="preserve">Der Bandpass </w:t>
-      </w:r>
-      <w:r>
-        <w:t>sorgt dafür, dass nur die Zielfrequenz verarbeitet wird im Rx oder Tx pfad.</w:t>
+        <w:t xml:space="preserve">Der </w:t>
+      </w:r>
+      <w:proofErr w:type="spellStart"/>
+      <w:r>
+        <w:t>Bandpass</w:t>
+      </w:r>
+      <w:proofErr w:type="spellEnd"/>
+      <w:r>
+        <w:t xml:space="preserve"> </w:t>
+      </w:r>
+      <w:r>
+        <w:t xml:space="preserve">sorgt dafür, dass nur die Zielfrequenz verarbeitet wird im </w:t>
+      </w:r>
+      <w:proofErr w:type="spellStart"/>
+      <w:r>
+        <w:t>Rx</w:t>
+      </w:r>
+      <w:proofErr w:type="spellEnd"/>
+      <w:r>
+        <w:t xml:space="preserve"> oder </w:t>
+      </w:r>
+      <w:proofErr w:type="spellStart"/>
+      <w:r>
+        <w:t>Tx</w:t>
+      </w:r>
+      <w:proofErr w:type="spellEnd"/>
+      <w:r>
+        <w:t xml:space="preserve"> </w:t>
+      </w:r>
+      <w:proofErr w:type="spellStart"/>
+      <w:r>
+        <w:t>pfad</w:t>
+      </w:r>
+      <w:proofErr w:type="spellEnd"/>
+      <w:r>
+        <w:t>.</w:t>
       </w:r>
     </w:p>
     <w:tbl>
@@ -2553,9 +2740,11 @@
             <w:tcW w:w="2447" w:type="dxa"/>
           </w:tcPr>
           <w:p>
+            <w:proofErr w:type="spellStart"/>
             <w:r>
               <w:t>Bandpass</w:t>
             </w:r>
+            <w:proofErr w:type="spellEnd"/>
           </w:p>
         </w:tc>
         <w:tc>
@@ -2665,8 +2854,13 @@
               <w:cnfStyle w:val="000000100000" w:firstRow="0" w:lastRow="0" w:firstColumn="0" w:lastColumn="0" w:oddVBand="0" w:evenVBand="0" w:oddHBand="1" w:evenHBand="0" w:firstRowFirstColumn="0" w:firstRowLastColumn="0" w:lastRowFirstColumn="0" w:lastRowLastColumn="0"/>
             </w:pPr>
             <w:r>
-              <w:t>22.7 dBm</w:t>
-            </w:r>
+              <w:t xml:space="preserve">22.7 </w:t>
+            </w:r>
+            <w:proofErr w:type="spellStart"/>
+            <w:r>
+              <w:t>dBm</w:t>
+            </w:r>
+            <w:proofErr w:type="spellEnd"/>
           </w:p>
         </w:tc>
         <w:tc>
@@ -2802,9 +2996,11 @@
             <w:pPr>
               <w:cnfStyle w:val="100000000000" w:firstRow="1" w:lastRow="0" w:firstColumn="0" w:lastColumn="0" w:oddVBand="0" w:evenVBand="0" w:oddHBand="0" w:evenHBand="0" w:firstRowFirstColumn="0" w:firstRowLastColumn="0" w:lastRowFirstColumn="0" w:lastRowLastColumn="0"/>
             </w:pPr>
+            <w:proofErr w:type="spellStart"/>
             <w:r>
               <w:t>Voltage</w:t>
             </w:r>
+            <w:proofErr w:type="spellEnd"/>
           </w:p>
         </w:tc>
         <w:tc>
@@ -2879,8 +3075,13 @@
               <w:cnfStyle w:val="000000100000" w:firstRow="0" w:lastRow="0" w:firstColumn="0" w:lastColumn="0" w:oddVBand="0" w:evenVBand="0" w:oddHBand="1" w:evenHBand="0" w:firstRowFirstColumn="0" w:firstRowLastColumn="0" w:lastRowFirstColumn="0" w:lastRowLastColumn="0"/>
             </w:pPr>
             <w:r>
-              <w:t>32 dBm</w:t>
-            </w:r>
+              <w:t xml:space="preserve">32 </w:t>
+            </w:r>
+            <w:proofErr w:type="spellStart"/>
+            <w:r>
+              <w:t>dBm</w:t>
+            </w:r>
+            <w:proofErr w:type="spellEnd"/>
           </w:p>
         </w:tc>
         <w:tc>
@@ -2905,8 +3106,13 @@
               <w:t>12.0</w:t>
             </w:r>
             <w:r>
-              <w:t xml:space="preserve"> dBm</w:t>
-            </w:r>
+              <w:t xml:space="preserve"> </w:t>
+            </w:r>
+            <w:proofErr w:type="spellStart"/>
+            <w:r>
+              <w:t>dBm</w:t>
+            </w:r>
+            <w:proofErr w:type="spellEnd"/>
           </w:p>
         </w:tc>
         <w:tc>
@@ -3162,8 +3368,13 @@
               <w:cnfStyle w:val="000000100000" w:firstRow="0" w:lastRow="0" w:firstColumn="0" w:lastColumn="0" w:oddVBand="0" w:evenVBand="0" w:oddHBand="1" w:evenHBand="0" w:firstRowFirstColumn="0" w:firstRowLastColumn="0" w:lastRowFirstColumn="0" w:lastRowLastColumn="0"/>
             </w:pPr>
             <w:r>
-              <w:t>22 dBm</w:t>
-            </w:r>
+              <w:t xml:space="preserve">22 </w:t>
+            </w:r>
+            <w:proofErr w:type="spellStart"/>
+            <w:r>
+              <w:t>dBm</w:t>
+            </w:r>
+            <w:proofErr w:type="spellEnd"/>
           </w:p>
         </w:tc>
         <w:tc>
@@ -3258,9 +3469,11 @@
             <w:tcW w:w="1619" w:type="dxa"/>
           </w:tcPr>
           <w:p>
+            <w:proofErr w:type="spellStart"/>
             <w:r>
               <w:t>Bandpass</w:t>
             </w:r>
+            <w:proofErr w:type="spellEnd"/>
           </w:p>
         </w:tc>
         <w:tc>
@@ -3533,6 +3746,125 @@
           <w:lang w:val="en-US"/>
         </w:rPr>
         <w:t>Connector_Coaxial:SMA_Amphenol_132289_EdgeMount</w:t>
+      </w:r>
+    </w:p>
+    <w:p>
+      <w:pPr>
+        <w:pStyle w:val="ListParagraph"/>
+        <w:numPr>
+          <w:ilvl w:val="0"/>
+          <w:numId w:val="7"/>
+        </w:numPr>
+        <w:rPr>
+          <w:lang w:val="en-US"/>
+        </w:rPr>
+      </w:pPr>
+      <w:r>
+        <w:rPr>
+          <w:lang w:val="en-US"/>
+        </w:rPr>
+        <w:t xml:space="preserve">Connector barrel jack: </w:t>
+      </w:r>
+      <w:hyperlink r:id="rId20" w:history="1">
+        <w:r>
+          <w:rPr>
+            <w:rStyle w:val="Hyperlink"/>
+            <w:lang w:val="en-US"/>
+          </w:rPr>
+          <w:t>https://www.mouser.de/ProductDetail/Same-Sky/PJ-063AH?qs=WyjlAZoYn51bQfA53nMcVA%3D%3D</w:t>
+        </w:r>
+      </w:hyperlink>
+    </w:p>
+    <w:p>
+      <w:pPr>
+        <w:rPr>
+          <w:lang w:val="en-US"/>
+        </w:rPr>
+      </w:pPr>
+      <w:r>
+        <w:rPr>
+          <w:lang w:val="en-US"/>
+        </w:rPr>
+        <w:t>Antenne:</w:t>
+      </w:r>
+    </w:p>
+    <w:p>
+      <w:pPr>
+        <w:rPr>
+          <w:lang w:val="en-US"/>
+        </w:rPr>
+      </w:pPr>
+      <w:r>
+        <w:rPr>
+          <w:lang w:val="en-US"/>
+        </w:rPr>
+        <w:t>Antenne an Rx out &amp; Tx Out:</w:t>
+      </w:r>
+    </w:p>
+    <w:p>
+      <w:pPr>
+        <w:rPr>
+          <w:lang w:val="en-US"/>
+        </w:rPr>
+      </w:pPr>
+      <w:r>
+        <w:rPr>
+          <w:lang w:val="en-US"/>
+        </w:rPr>
+        <w:t>ANT-2.4-LCW-SMA</w:t>
+      </w:r>
+    </w:p>
+    <w:p>
+      <w:pPr>
+        <w:rPr>
+          <w:lang w:val="en-US"/>
+        </w:rPr>
+      </w:pPr>
+      <w:r>
+        <w:rPr>
+          <w:lang w:val="en-US"/>
+        </w:rPr>
+        <w:lastRenderedPageBreak/>
+        <w:t>https://www.mouser.de/ProductDetail/TE-Connectivity-Linx-Technologies/ANT-2.4-LCW-SMA?qs=lc2O%252BfHJPVbmLk5xl5vRaA%3D%3D</w:t>
+      </w:r>
+    </w:p>
+    <w:p>
+      <w:pPr>
+        <w:rPr>
+          <w:lang w:val="en-US"/>
+        </w:rPr>
+      </w:pPr>
+      <w:r>
+        <w:rPr>
+          <w:lang w:val="en-US"/>
+        </w:rPr>
+        <w:t>Peak Gain: 2.8dBi</w:t>
+      </w:r>
+    </w:p>
+    <w:p>
+      <w:pPr>
+        <w:rPr>
+          <w:lang w:val="en-US"/>
+        </w:rPr>
+      </w:pPr>
+      <w:r>
+        <w:rPr>
+          <w:lang w:val="en-US"/>
+        </w:rPr>
+        <w:t>Average gain: -0.6dBi typical</w:t>
+      </w:r>
+    </w:p>
+    <w:p>
+      <w:pPr>
+        <w:rPr>
+          <w:lang w:val="en-US"/>
+        </w:rPr>
+      </w:pPr>
+      <w:r>
+        <w:rPr>
+          <w:lang w:val="en-US"/>
+        </w:rPr>
+        <w:t>VSWR: &lt;2:1</w:t>
       </w:r>
     </w:p>
     <w:sectPr>

</xml_diff>